<commit_message>
Vereenvoudig dashboardcode en werk oefenmateriaal bij
</commit_message>
<xml_diff>
--- a/documentatie/Oefenen_live_coding_case_5.docx
+++ b/documentatie/Oefenen_live_coding_case_5.docx
@@ -24,7 +24,7 @@
         <w:spacing w:after="120"/>
       </w:pPr>
       <w:r>
-        <w:t>Met deze 32 oefeningen bereid je je voor op de code-overhoring van je eigen dashboard. De indeling A tot en met H volgt de aangeleverde Titanic-oefenset. Elke opdracht is aangepast aan app.py en data_ophalen.py van jouw casus.</w:t>
+        <w:t>Met deze 32 oefeningen bereid je je voor op de code-overhoring van je eigen dashboard. De indeling A tot en met H volgt de Titanic-oefenset. De oefeningen sluiten aan op de vereenvoudigde app.py en de Python-, pandas- en Plotly-onderwerpen uit je DataCamp-overzicht.</w:t>
       </w:r>
     </w:p>
     <w:p>
@@ -93,7 +93,7 @@
         <w:spacing w:after="120"/>
       </w:pPr>
       <w:r>
-        <w:t>app.py bevat elf genummerde blokken. Zoek op de bloknaam met Ctrl+F. Er zijn geen verborgen analysebestanden; data_ophalen.py doet alleen het verzamelen.</w:t>
+        <w:t>app.py bevat elf genummerde blokken met alle berekeningen, filters en grafieken. Zoek op de bloknaam met Ctrl+F. teksten.py bevat alleen vaste schermteksten en opmaak; data_ophalen.py verzamelt de bronnen. Houd bij het oefenen deze drie rollen uit elkaar.</w:t>
       </w:r>
     </w:p>
     <w:p>
@@ -109,7 +109,7 @@
         <w:spacing w:after="120"/>
       </w:pPr>
       <w:r>
-        <w:t>4 grafiekopmaak   5 opstarten en fouten   6 filters en selectie</w:t>
+        <w:t>4 grafiekopmaak en puntenwolk   5 opstarten en fouten   6 filters en selectie</w:t>
       </w:r>
     </w:p>
     <w:p>
@@ -133,7 +133,7 @@
         <w:spacing w:after="120"/>
       </w:pPr>
       <w:r>
-        <w:t>Een voldoende vraagt dat je het merendeel zelfstandig doet. Eén hint nodig hebben op iedere vraag is volgens de beoordelingsladder nog geen voldoende. Oefen daarom ook waar de code staat en waarom de verandering klopt.</w:t>
+        <w:t>Begin bij de filters in blok 6 en de KPI’s in blok 7. Daarna oefen je de berekeningen in blok 3. laad_data leest en koppelt; vergelijk_jaren berekent veranderingen; puntenwolk maakt een puntenwolk en toon_grafiek toont die. Reguliere pandas-filters, dropna, merge en duidelijke kolommen vormen de basis. De regressie gebruikt SciPy; leg helling en interval in eigen woorden uit.</w:t>
       </w:r>
     </w:p>
     <w:p>
@@ -596,7 +596,7 @@
         <w:spacing w:after="120"/>
       </w:pPr>
       <w:r>
-        <w:t>Zoekplek: Blok 8 bij de scatter.</w:t>
+        <w:t>Zoekplek: Blok 8 bij fig = puntenwolk(selectie), met de functie puntenwolk in blok 4.</w:t>
       </w:r>
     </w:p>
     <w:p>
@@ -604,7 +604,7 @@
         <w:spacing w:after="120"/>
       </w:pPr>
       <w:r>
-        <w:t>Laat de gebruiker kiezen tussen co2_groei en intensiteit_groei op de y-as van de puntenwolk. Werk titel, aslabel en hulplijnen bij.</w:t>
+        <w:t>Laat de gebruiker kiezen tussen co2_groei en intensiteit_groei op de y-as. Geef die kolomnaam mee aan puntenwolk. Controleer het aslabel en toon de diagonale hulplijn alleen bij totale CO2-verandering.</w:t>
       </w:r>
     </w:p>
     <w:p>
@@ -1426,31 +1426,31 @@
           <w:rFonts w:ascii="Consolas" w:hAnsi="Consolas"/>
           <w:sz w:val="17"/>
         </w:rPr>
-        <w:t>fout = (samen["co2_eind"].isna() &amp; samen["co2_start"].gt(0)</w:t>
+        <w:t>fout = (samen["co2_eind"].isna() &amp; (samen["co2_start"] &gt; 0)</w:t>
+        <w:br/>
+        <w:t xml:space="preserve">        &amp; (samen["bbp_eind"] &gt; samen["bbp_start"])</w:t>
+        <w:br/>
+        <w:t xml:space="preserve">        &amp; (samen["bbp_start"] &gt; 0))</w:t>
+        <w:br/>
+        <w:t>print(int(fout.sum()))</w:t>
       </w:r>
       <w:r>
         <w:rPr>
           <w:rFonts w:ascii="Consolas" w:hAnsi="Consolas"/>
           <w:sz w:val="17"/>
         </w:rPr>
-        <w:br/>
-        <w:t xml:space="preserve">        &amp; samen["bbp_eind"].gt(samen["bbp_start"])</w:t>
       </w:r>
       <w:r>
         <w:rPr>
           <w:rFonts w:ascii="Consolas" w:hAnsi="Consolas"/>
           <w:sz w:val="17"/>
         </w:rPr>
-        <w:br/>
-        <w:t xml:space="preserve">        &amp; samen["bbp_start"].gt(0))</w:t>
       </w:r>
       <w:r>
         <w:rPr>
           <w:rFonts w:ascii="Consolas" w:hAnsi="Consolas"/>
           <w:sz w:val="17"/>
         </w:rPr>
-        <w:br/>
-        <w:t>print(int(fout.sum()))</w:t>
       </w:r>
     </w:p>
     <w:p>
@@ -1932,7 +1932,7 @@
         <w:spacing w:after="120"/>
       </w:pPr>
       <w:r>
-        <w:t>De selectbox geeft de kolomnaam als str terug. De grens voor relatieve ontkoppeling is bij intensiteitsverandering y=0, niet y=x. Toon de diagonale lijn dus alleen bij co2_groei.</w:t>
+        <w:t>De selectbox geeft een kolomnaam als tekst terug. puntenwolk heeft daarvoor al de parameter y_kolom. Het aslabel komt uit teksten.ASSEN. De grens voor relatieve ontkoppeling is bij intensiteitsverandering y=0. De diagonaal y=x hoort alleen bij co2_groei.</w:t>
       </w:r>
     </w:p>
     <w:p>
@@ -1945,30 +1945,30 @@
           <w:sz w:val="17"/>
         </w:rPr>
         <w:t>y_kolom = st.selectbox("Uitkomst", ["co2_groei", "intensiteit_groei"])</w:t>
+        <w:br/>
+        <w:t>fig = puntenwolk(selectie, y_kolom)</w:t>
+        <w:br/>
+        <w:t># Zet de bestaande fig.add_shape met de diagonaal binnen:</w:t>
+        <w:br/>
+        <w:t># if y_kolom == "co2_groei":</w:t>
       </w:r>
       <w:r>
         <w:rPr>
           <w:rFonts w:ascii="Consolas" w:hAnsi="Consolas"/>
           <w:sz w:val="17"/>
         </w:rPr>
-        <w:br/>
-        <w:t># Geef y=y_kolom aan px.scatter.</w:t>
       </w:r>
       <w:r>
         <w:rPr>
           <w:rFonts w:ascii="Consolas" w:hAnsi="Consolas"/>
           <w:sz w:val="17"/>
         </w:rPr>
-        <w:br/>
-        <w:t># Zet fig.add_shape met de diagonaal binnen:</w:t>
       </w:r>
       <w:r>
         <w:rPr>
           <w:rFonts w:ascii="Consolas" w:hAnsi="Consolas"/>
           <w:sz w:val="17"/>
         </w:rPr>
-        <w:br/>
-        <w:t># if y_kolom == "co2_groei":</w:t>
       </w:r>
     </w:p>
     <w:p>
@@ -2508,38 +2508,42 @@
           <w:sz w:val="17"/>
         </w:rPr>
         <w:t>samen["groeigroep"] = pd.cut(samen["bbp_groei"],</w:t>
+        <w:br/>
+        <w:t xml:space="preserve">    [-float("inf"), 0, 50, float("inf")],</w:t>
+        <w:br/>
+        <w:t xml:space="preserve">    labels=["Geen groei", "Tot 50%", "Boven 50%"], right=True)</w:t>
+        <w:br/>
+        <w:t># In blok 11:</w:t>
+        <w:br/>
+        <w:t>aandelen = selectie.copy()</w:t>
+        <w:br/>
+        <w:t>aandelen["absoluut"] = aandelen["status"] == "Absoluut"</w:t>
+        <w:br/>
+        <w:t>st.dataframe(aandelen.groupby("groeigroep", observed=True)["absoluut"].mean() * 100)</w:t>
       </w:r>
       <w:r>
         <w:rPr>
           <w:rFonts w:ascii="Consolas" w:hAnsi="Consolas"/>
           <w:sz w:val="17"/>
         </w:rPr>
-        <w:br/>
-        <w:t xml:space="preserve">    [-np.inf, 0, 50, np.inf], labels=["Geen groei", "Tot 50%", "Boven 50%"], right=True)</w:t>
       </w:r>
       <w:r>
         <w:rPr>
           <w:rFonts w:ascii="Consolas" w:hAnsi="Consolas"/>
           <w:sz w:val="17"/>
         </w:rPr>
-        <w:br/>
-        <w:t># In blok 11:</w:t>
       </w:r>
       <w:r>
         <w:rPr>
           <w:rFonts w:ascii="Consolas" w:hAnsi="Consolas"/>
           <w:sz w:val="17"/>
         </w:rPr>
-        <w:br/>
-        <w:t>aandelen = selectie.assign(absoluut=selectie["status"].eq("Absoluut"))</w:t>
       </w:r>
       <w:r>
         <w:rPr>
           <w:rFonts w:ascii="Consolas" w:hAnsi="Consolas"/>
           <w:sz w:val="17"/>
         </w:rPr>
-        <w:br/>
-        <w:t>st.dataframe(aandelen.groupby("groeigroep", observed=True)["absoluut"].mean() * 100)</w:t>
       </w:r>
     </w:p>
     <w:p>

</xml_diff>